<commit_message>
Add the profile photo to the CV header
A 27mm square portrait sits top right, next to the name. The header became
a borderless two-cell table so the photo stays pinned to the right margin
without pushing the text.

The photo is cropped from the portrait already used on the site: square,
centred on the face at 40% of the height, with a light lift because the
original is a night shot and would print muddy.

Images now go through one helper and use automatic line spacing: with the
fixed leading used for text, the paragraph box clipped the top of the
picture (the QR had the same flaw).

Co-Authored-By: Claude Opus 5 <noreply@anthropic.com>
</commit_message>
<xml_diff>
--- a/cv/Adriano-Parmentola-CV.docx
+++ b/cv/Adriano-Parmentola-CV.docx
@@ -2,75 +2,150 @@
 <file path=word/document.xml><?xml version="1.0" encoding="utf-8"?>
 <w:document xmlns:w="http://schemas.openxmlformats.org/wordprocessingml/2006/main" xmlns:r="http://schemas.openxmlformats.org/officeDocument/2006/relationships" xmlns:wp="http://schemas.openxmlformats.org/drawingml/2006/wordprocessingDrawing" xmlns:a="http://schemas.openxmlformats.org/drawingml/2006/main" xmlns:pic="http://schemas.openxmlformats.org/drawingml/2006/picture">
   <w:body>
-    <w:p>
-      <w:pPr>
-        <w:spacing w:before="0" w:after="0" w:line="420" w:lineRule="exact"/>
-      </w:pPr>
-      <w:r>
-        <w:rPr>
-          <w:rFonts w:ascii="Arial" w:hAnsi="Arial" w:cs="Arial"/>
-          <w:b/>
-          <w:color w:val="111111"/>
-          <w:sz w:val="38"/>
-          <w:szCs w:val="38"/>
-          <w:spacing w:val="0"/>
-        </w:rPr>
-        <w:t xml:space="preserve">ADRIANO PARMENTOLA</w:t>
-      </w:r>
-    </w:p>
-    <w:p>
-      <w:pPr>
-        <w:spacing w:before="40" w:after="0" w:line="190" w:lineRule="exact"/>
-      </w:pPr>
-      <w:r>
-        <w:rPr>
-          <w:rFonts w:ascii="Arial" w:hAnsi="Arial" w:cs="Arial"/>
-          <w:b/>
-          <w:color w:val="111111"/>
-          <w:sz w:val="16"/>
-          <w:szCs w:val="16"/>
-          <w:spacing w:val="0"/>
-        </w:rPr>
-        <w:t xml:space="preserve">SERVICE DESIGNER · HOSPITALITY &amp; FOOD EXPERIENCE</w:t>
-      </w:r>
-    </w:p>
-    <w:p>
-      <w:pPr>
-        <w:spacing w:before="70" w:after="40" w:line="190" w:lineRule="exact"/>
-      </w:pPr>
-      <w:r>
-        <w:rPr>
-          <w:rFonts w:ascii="Arial" w:hAnsi="Arial" w:cs="Arial"/>
-          <w:color w:val="595959"/>
-          <w:sz w:val="16"/>
-          <w:szCs w:val="16"/>
-          <w:spacing w:val="0"/>
-        </w:rPr>
-        <w:t xml:space="preserve">Bologna, IT      ·      </w:t>
-      </w:r>
-      <w:r>
-        <w:rPr>
-          <w:rFonts w:ascii="Arial" w:hAnsi="Arial" w:cs="Arial"/>
-          <w:color w:val="595959"/>
-          <w:sz w:val="16"/>
-          <w:szCs w:val="16"/>
-          <w:spacing w:val="0"/>
-        </w:rPr>
-        <w:t xml:space="preserve">+39 366 291 1928      ·      </w:t>
-      </w:r>
-      <w:hyperlink r:id="rId6">
-        <w:r>
-          <w:rPr>
-            <w:rFonts w:ascii="Arial" w:hAnsi="Arial" w:cs="Arial"/>
-            <w:color w:val="595959"/>
-            <w:sz w:val="16"/>
-            <w:szCs w:val="16"/>
-            <w:spacing w:val="0"/>
-          </w:rPr>
-          <w:t xml:space="preserve">adrianoparmentola03@gmail.com</w:t>
-        </w:r>
-      </w:hyperlink>
-    </w:p>
+    <w:tbl>
+      <w:tblPr>
+        <w:tblW w:w="10206" w:type="dxa"/>
+        <w:tblLayout w:type="fixed"/>
+        <w:tblCellMar>
+          <w:left w:w="0" w:type="dxa"/>
+          <w:right w:w="0" w:type="dxa"/>
+        </w:tblCellMar>
+      </w:tblPr>
+      <w:tblGrid>
+        <w:gridCol w:w="8675"/>
+        <w:gridCol w:w="1531"/>
+      </w:tblGrid>
+      <w:tr>
+        <w:tc>
+          <w:tcPr>
+            <w:tcW w:w="8675" w:type="dxa"/>
+            <w:vAlign w:val="top"/>
+            <w:tcMar>
+              <w:left w:w="0" w:type="dxa"/>
+              <w:right w:w="240" w:type="dxa"/>
+            </w:tcMar>
+          </w:tcPr>
+          <w:p>
+            <w:pPr>
+              <w:spacing w:before="0" w:after="0" w:line="420" w:lineRule="exact"/>
+            </w:pPr>
+            <w:r>
+              <w:rPr>
+                <w:rFonts w:ascii="Arial" w:hAnsi="Arial" w:cs="Arial"/>
+                <w:b/>
+                <w:color w:val="111111"/>
+                <w:sz w:val="38"/>
+                <w:szCs w:val="38"/>
+                <w:spacing w:val="0"/>
+              </w:rPr>
+              <w:t xml:space="preserve">ADRIANO PARMENTOLA</w:t>
+            </w:r>
+          </w:p>
+          <w:p>
+            <w:pPr>
+              <w:spacing w:before="40" w:after="0" w:line="190" w:lineRule="exact"/>
+            </w:pPr>
+            <w:r>
+              <w:rPr>
+                <w:rFonts w:ascii="Arial" w:hAnsi="Arial" w:cs="Arial"/>
+                <w:b/>
+                <w:color w:val="111111"/>
+                <w:sz w:val="16"/>
+                <w:szCs w:val="16"/>
+                <w:spacing w:val="0"/>
+              </w:rPr>
+              <w:t xml:space="preserve">SERVICE DESIGNER · HOSPITALITY &amp; FOOD EXPERIENCE</w:t>
+            </w:r>
+          </w:p>
+          <w:p>
+            <w:pPr>
+              <w:spacing w:before="70" w:after="0" w:line="190" w:lineRule="exact"/>
+            </w:pPr>
+            <w:r>
+              <w:rPr>
+                <w:rFonts w:ascii="Arial" w:hAnsi="Arial" w:cs="Arial"/>
+                <w:color w:val="595959"/>
+                <w:sz w:val="16"/>
+                <w:szCs w:val="16"/>
+                <w:spacing w:val="0"/>
+              </w:rPr>
+              <w:t xml:space="preserve">Bologna, IT      ·      </w:t>
+            </w:r>
+            <w:r>
+              <w:rPr>
+                <w:rFonts w:ascii="Arial" w:hAnsi="Arial" w:cs="Arial"/>
+                <w:color w:val="595959"/>
+                <w:sz w:val="16"/>
+                <w:szCs w:val="16"/>
+                <w:spacing w:val="0"/>
+              </w:rPr>
+              <w:t xml:space="preserve">+39 366 291 1928      ·      </w:t>
+            </w:r>
+            <w:hyperlink r:id="rId6">
+              <w:r>
+                <w:rPr>
+                  <w:rFonts w:ascii="Arial" w:hAnsi="Arial" w:cs="Arial"/>
+                  <w:color w:val="595959"/>
+                  <w:sz w:val="16"/>
+                  <w:szCs w:val="16"/>
+                  <w:spacing w:val="0"/>
+                </w:rPr>
+                <w:t xml:space="preserve">adrianoparmentola03@gmail.com</w:t>
+              </w:r>
+            </w:hyperlink>
+          </w:p>
+        </w:tc>
+        <w:tc>
+          <w:tcPr>
+            <w:tcW w:w="1531" w:type="dxa"/>
+            <w:vAlign w:val="top"/>
+            <w:tcMar>
+              <w:left w:w="0" w:type="dxa"/>
+              <w:right w:w="0" w:type="dxa"/>
+            </w:tcMar>
+          </w:tcPr>
+          <w:p>
+            <w:pPr>
+              <w:jc w:val="right"/>
+              <w:spacing w:before="0" w:after="0" w:line="240" w:lineRule="auto"/>
+            </w:pPr>
+            <w:r>
+              <w:drawing>
+                <wp:inline distT="0" distB="0" distL="0" distR="0">
+                  <wp:extent cx="972000" cy="972000"/>
+                  <wp:docPr id="9" name="Foto"/>
+                  <a:graphic xmlns:a="http://schemas.openxmlformats.org/drawingml/2006/main">
+                    <a:graphicData uri="http://schemas.openxmlformats.org/drawingml/2006/picture">
+                      <pic:pic xmlns:pic="http://schemas.openxmlformats.org/drawingml/2006/picture">
+                        <pic:nvPicPr>
+                          <pic:cNvPr id="9" name="Foto"/>
+                          <pic:cNvPicPr/>
+                        </pic:nvPicPr>
+                        <pic:blipFill>
+                          <a:blip xmlns:r="http://schemas.openxmlformats.org/officeDocument/2006/relationships" r:embed="rId9"/>
+                          <a:stretch>
+                            <a:fillRect/>
+                          </a:stretch>
+                        </pic:blipFill>
+                        <pic:spPr>
+                          <a:xfrm>
+                            <a:off x="0" y="0"/>
+                            <a:ext cx="972000" cy="972000"/>
+                          </a:xfrm>
+                          <a:prstGeom prst="rect">
+                            <a:avLst/>
+                          </a:prstGeom>
+                        </pic:spPr>
+                      </pic:pic>
+                    </a:graphicData>
+                  </a:graphic>
+                </wp:inline>
+              </w:drawing>
+            </w:r>
+          </w:p>
+        </w:tc>
+      </w:tr>
+    </w:tbl>
     <w:p>
       <w:pPr>
         <w:pBdr>

</xml_diff>